<commit_message>
Correction du plan de développement
</commit_message>
<xml_diff>
--- a/Plan de développement.docx
+++ b/Plan de développement.docx
@@ -318,14 +318,33 @@
           <w:ilvl w:val="1"/>
           <w:numId w:val="2"/>
         </w:numPr>
+        <w:spacing w:after="0" w:afterAutospacing="0" w:before="0" w:beforeAutospacing="0" w:lineRule="auto"/>
+        <w:ind w:left="1440" w:hanging="360"/>
+      </w:pPr>
+      <w:r>
+        <w:rPr>
+          <w:rtl w:val="0"/>
+        </w:rPr>
+        <w:t xml:space="preserve">modification de données</w:t>
+      </w:r>
+    </w:p>
+    <w:p>
+      <w:pPr>
+        <w:numPr>
+          <w:ilvl w:val="1"/>
+          <w:numId w:val="2"/>
+        </w:numPr>
         <w:spacing w:after="240" w:before="0" w:beforeAutospacing="0" w:lineRule="auto"/>
         <w:ind w:left="1440" w:hanging="360"/>
-      </w:pPr>
-      <w:r>
-        <w:rPr>
-          <w:rtl w:val="0"/>
-        </w:rPr>
-        <w:t xml:space="preserve">modification de données</w:t>
+        <w:rPr>
+          <w:u w:val="none"/>
+        </w:rPr>
+      </w:pPr>
+      <w:r>
+        <w:rPr>
+          <w:rtl w:val="0"/>
+        </w:rPr>
+        <w:t xml:space="preserve">amélioration de l'algorithme d’évaluation actuel</w:t>
       </w:r>
     </w:p>
     <w:p>
@@ -484,7 +503,7 @@
         <w:rPr>
           <w:rtl w:val="0"/>
         </w:rPr>
-        <w:t xml:space="preserve">Python donc nous continuerons de l'utiliser pour le développement du modèle. De même, les données sont déjà sous format JSON et sont open source car publiques.</w:t>
+        <w:t xml:space="preserve">Python. Nous continuerons de l'utiliser pour le développement du modèle avec les librairies transformers et pytorch. De même, les données sont déjà sous format JSON et sont open source car publiques.</w:t>
       </w:r>
     </w:p>
     <w:p>

</xml_diff>